<commit_message>
docs: insert official Techfest headers and footers into DOCX report
</commit_message>
<xml_diff>
--- a/Stage1_Report.docx
+++ b/Stage1_Report.docx
@@ -19,13 +19,13 @@
         <w:tblLook w:firstColumn="1" w:firstRow="1" w:lastColumn="0" w:lastRow="0" w:noHBand="0" w:noVBand="1" w:val="04A0"/>
       </w:tblPr>
       <w:tblGrid>
-        <w:gridCol w:w="4320"/>
-        <w:gridCol w:w="4320"/>
+        <w:gridCol w:w="4680"/>
+        <w:gridCol w:w="4680"/>
       </w:tblGrid>
       <w:tr>
         <w:tc>
           <w:tcPr>
-            <w:tcW w:type="dxa" w:w="4320"/>
+            <w:tcW w:type="dxa" w:w="4680"/>
           </w:tcPr>
           <w:p>
             <w:r>
@@ -38,7 +38,7 @@
         </w:tc>
         <w:tc>
           <w:tcPr>
-            <w:tcW w:type="dxa" w:w="4320"/>
+            <w:tcW w:type="dxa" w:w="4680"/>
           </w:tcPr>
           <w:p>
             <w:r>
@@ -50,7 +50,7 @@
       <w:tr>
         <w:tc>
           <w:tcPr>
-            <w:tcW w:type="dxa" w:w="4320"/>
+            <w:tcW w:type="dxa" w:w="4680"/>
           </w:tcPr>
           <w:p>
             <w:r>
@@ -63,7 +63,7 @@
         </w:tc>
         <w:tc>
           <w:tcPr>
-            <w:tcW w:type="dxa" w:w="4320"/>
+            <w:tcW w:type="dxa" w:w="4680"/>
           </w:tcPr>
           <w:p>
             <w:r>
@@ -75,7 +75,7 @@
       <w:tr>
         <w:tc>
           <w:tcPr>
-            <w:tcW w:type="dxa" w:w="4320"/>
+            <w:tcW w:type="dxa" w:w="4680"/>
           </w:tcPr>
           <w:p>
             <w:r>
@@ -88,7 +88,7 @@
         </w:tc>
         <w:tc>
           <w:tcPr>
-            <w:tcW w:type="dxa" w:w="4320"/>
+            <w:tcW w:type="dxa" w:w="4680"/>
           </w:tcPr>
           <w:p>
             <w:r>
@@ -100,7 +100,7 @@
       <w:tr>
         <w:tc>
           <w:tcPr>
-            <w:tcW w:type="dxa" w:w="4320"/>
+            <w:tcW w:type="dxa" w:w="4680"/>
           </w:tcPr>
           <w:p>
             <w:r>
@@ -113,7 +113,7 @@
         </w:tc>
         <w:tc>
           <w:tcPr>
-            <w:tcW w:type="dxa" w:w="4320"/>
+            <w:tcW w:type="dxa" w:w="4680"/>
           </w:tcPr>
           <w:p>
             <w:r>
@@ -125,7 +125,7 @@
       <w:tr>
         <w:tc>
           <w:tcPr>
-            <w:tcW w:type="dxa" w:w="4320"/>
+            <w:tcW w:type="dxa" w:w="4680"/>
           </w:tcPr>
           <w:p>
             <w:r>
@@ -138,7 +138,7 @@
         </w:tc>
         <w:tc>
           <w:tcPr>
-            <w:tcW w:type="dxa" w:w="4320"/>
+            <w:tcW w:type="dxa" w:w="4680"/>
           </w:tcPr>
           <w:p>
             <w:r>
@@ -150,7 +150,7 @@
       <w:tr>
         <w:tc>
           <w:tcPr>
-            <w:tcW w:type="dxa" w:w="4320"/>
+            <w:tcW w:type="dxa" w:w="4680"/>
           </w:tcPr>
           <w:p>
             <w:r>
@@ -163,7 +163,7 @@
         </w:tc>
         <w:tc>
           <w:tcPr>
-            <w:tcW w:type="dxa" w:w="4320"/>
+            <w:tcW w:type="dxa" w:w="4680"/>
           </w:tcPr>
           <w:p>
             <w:r>
@@ -175,7 +175,7 @@
       <w:tr>
         <w:tc>
           <w:tcPr>
-            <w:tcW w:type="dxa" w:w="4320"/>
+            <w:tcW w:type="dxa" w:w="4680"/>
           </w:tcPr>
           <w:p>
             <w:r>
@@ -188,7 +188,7 @@
         </w:tc>
         <w:tc>
           <w:tcPr>
-            <w:tcW w:type="dxa" w:w="4320"/>
+            <w:tcW w:type="dxa" w:w="4680"/>
           </w:tcPr>
           <w:p>
             <w:r>
@@ -200,7 +200,7 @@
       <w:tr>
         <w:tc>
           <w:tcPr>
-            <w:tcW w:type="dxa" w:w="4320"/>
+            <w:tcW w:type="dxa" w:w="4680"/>
           </w:tcPr>
           <w:p>
             <w:r>
@@ -213,7 +213,7 @@
         </w:tc>
         <w:tc>
           <w:tcPr>
-            <w:tcW w:type="dxa" w:w="4320"/>
+            <w:tcW w:type="dxa" w:w="4680"/>
           </w:tcPr>
           <w:p>
             <w:r>
@@ -225,7 +225,7 @@
       <w:tr>
         <w:tc>
           <w:tcPr>
-            <w:tcW w:type="dxa" w:w="4320"/>
+            <w:tcW w:type="dxa" w:w="4680"/>
           </w:tcPr>
           <w:p>
             <w:r>
@@ -238,7 +238,7 @@
         </w:tc>
         <w:tc>
           <w:tcPr>
-            <w:tcW w:type="dxa" w:w="4320"/>
+            <w:tcW w:type="dxa" w:w="4680"/>
           </w:tcPr>
           <w:p>
             <w:r>
@@ -250,7 +250,7 @@
       <w:tr>
         <w:tc>
           <w:tcPr>
-            <w:tcW w:type="dxa" w:w="4320"/>
+            <w:tcW w:type="dxa" w:w="4680"/>
           </w:tcPr>
           <w:p>
             <w:r>
@@ -263,7 +263,7 @@
         </w:tc>
         <w:tc>
           <w:tcPr>
-            <w:tcW w:type="dxa" w:w="4320"/>
+            <w:tcW w:type="dxa" w:w="4680"/>
           </w:tcPr>
           <w:p>
             <w:r>
@@ -275,13 +275,13 @@
       <w:tr>
         <w:tc>
           <w:tcPr>
-            <w:tcW w:type="dxa" w:w="4320"/>
+            <w:tcW w:type="dxa" w:w="4680"/>
           </w:tcPr>
           <w:p/>
         </w:tc>
         <w:tc>
           <w:tcPr>
-            <w:tcW w:type="dxa" w:w="4320"/>
+            <w:tcW w:type="dxa" w:w="4680"/>
           </w:tcPr>
           <w:p/>
         </w:tc>
@@ -401,16 +401,16 @@
         <w:tblLook w:firstColumn="1" w:firstRow="1" w:lastColumn="0" w:lastRow="0" w:noHBand="0" w:noVBand="1" w:val="04A0"/>
       </w:tblPr>
       <w:tblGrid>
-        <w:gridCol w:w="1728"/>
-        <w:gridCol w:w="1728"/>
-        <w:gridCol w:w="1728"/>
-        <w:gridCol w:w="1728"/>
-        <w:gridCol w:w="1728"/>
+        <w:gridCol w:w="1872"/>
+        <w:gridCol w:w="1872"/>
+        <w:gridCol w:w="1872"/>
+        <w:gridCol w:w="1872"/>
+        <w:gridCol w:w="1872"/>
       </w:tblGrid>
       <w:tr>
         <w:tc>
           <w:tcPr>
-            <w:tcW w:type="dxa" w:w="1728"/>
+            <w:tcW w:type="dxa" w:w="1872"/>
           </w:tcPr>
           <w:p>
             <w:r>
@@ -423,7 +423,7 @@
         </w:tc>
         <w:tc>
           <w:tcPr>
-            <w:tcW w:type="dxa" w:w="1728"/>
+            <w:tcW w:type="dxa" w:w="1872"/>
           </w:tcPr>
           <w:p>
             <w:r>
@@ -436,7 +436,7 @@
         </w:tc>
         <w:tc>
           <w:tcPr>
-            <w:tcW w:type="dxa" w:w="1728"/>
+            <w:tcW w:type="dxa" w:w="1872"/>
           </w:tcPr>
           <w:p>
             <w:r>
@@ -449,7 +449,7 @@
         </w:tc>
         <w:tc>
           <w:tcPr>
-            <w:tcW w:type="dxa" w:w="1728"/>
+            <w:tcW w:type="dxa" w:w="1872"/>
           </w:tcPr>
           <w:p>
             <w:r>
@@ -462,7 +462,7 @@
         </w:tc>
         <w:tc>
           <w:tcPr>
-            <w:tcW w:type="dxa" w:w="1728"/>
+            <w:tcW w:type="dxa" w:w="1872"/>
           </w:tcPr>
           <w:p>
             <w:r>
@@ -477,7 +477,7 @@
       <w:tr>
         <w:tc>
           <w:tcPr>
-            <w:tcW w:type="dxa" w:w="1728"/>
+            <w:tcW w:type="dxa" w:w="1872"/>
           </w:tcPr>
           <w:p>
             <w:r>
@@ -487,7 +487,7 @@
         </w:tc>
         <w:tc>
           <w:tcPr>
-            <w:tcW w:type="dxa" w:w="1728"/>
+            <w:tcW w:type="dxa" w:w="1872"/>
           </w:tcPr>
           <w:p>
             <w:r>
@@ -497,7 +497,7 @@
         </w:tc>
         <w:tc>
           <w:tcPr>
-            <w:tcW w:type="dxa" w:w="1728"/>
+            <w:tcW w:type="dxa" w:w="1872"/>
           </w:tcPr>
           <w:p>
             <w:r>
@@ -507,7 +507,7 @@
         </w:tc>
         <w:tc>
           <w:tcPr>
-            <w:tcW w:type="dxa" w:w="1728"/>
+            <w:tcW w:type="dxa" w:w="1872"/>
           </w:tcPr>
           <w:p>
             <w:r>
@@ -517,7 +517,7 @@
         </w:tc>
         <w:tc>
           <w:tcPr>
-            <w:tcW w:type="dxa" w:w="1728"/>
+            <w:tcW w:type="dxa" w:w="1872"/>
           </w:tcPr>
           <w:p>
             <w:r>
@@ -529,7 +529,7 @@
       <w:tr>
         <w:tc>
           <w:tcPr>
-            <w:tcW w:type="dxa" w:w="1728"/>
+            <w:tcW w:type="dxa" w:w="1872"/>
           </w:tcPr>
           <w:p>
             <w:r>
@@ -539,7 +539,7 @@
         </w:tc>
         <w:tc>
           <w:tcPr>
-            <w:tcW w:type="dxa" w:w="1728"/>
+            <w:tcW w:type="dxa" w:w="1872"/>
           </w:tcPr>
           <w:p>
             <w:r>
@@ -549,7 +549,7 @@
         </w:tc>
         <w:tc>
           <w:tcPr>
-            <w:tcW w:type="dxa" w:w="1728"/>
+            <w:tcW w:type="dxa" w:w="1872"/>
           </w:tcPr>
           <w:p>
             <w:r>
@@ -559,7 +559,7 @@
         </w:tc>
         <w:tc>
           <w:tcPr>
-            <w:tcW w:type="dxa" w:w="1728"/>
+            <w:tcW w:type="dxa" w:w="1872"/>
           </w:tcPr>
           <w:p>
             <w:r>
@@ -569,7 +569,7 @@
         </w:tc>
         <w:tc>
           <w:tcPr>
-            <w:tcW w:type="dxa" w:w="1728"/>
+            <w:tcW w:type="dxa" w:w="1872"/>
           </w:tcPr>
           <w:p>
             <w:r>
@@ -581,7 +581,7 @@
       <w:tr>
         <w:tc>
           <w:tcPr>
-            <w:tcW w:type="dxa" w:w="1728"/>
+            <w:tcW w:type="dxa" w:w="1872"/>
           </w:tcPr>
           <w:p>
             <w:r>
@@ -591,7 +591,7 @@
         </w:tc>
         <w:tc>
           <w:tcPr>
-            <w:tcW w:type="dxa" w:w="1728"/>
+            <w:tcW w:type="dxa" w:w="1872"/>
           </w:tcPr>
           <w:p>
             <w:r>
@@ -601,7 +601,7 @@
         </w:tc>
         <w:tc>
           <w:tcPr>
-            <w:tcW w:type="dxa" w:w="1728"/>
+            <w:tcW w:type="dxa" w:w="1872"/>
           </w:tcPr>
           <w:p>
             <w:r>
@@ -611,7 +611,7 @@
         </w:tc>
         <w:tc>
           <w:tcPr>
-            <w:tcW w:type="dxa" w:w="1728"/>
+            <w:tcW w:type="dxa" w:w="1872"/>
           </w:tcPr>
           <w:p>
             <w:r>
@@ -621,7 +621,7 @@
         </w:tc>
         <w:tc>
           <w:tcPr>
-            <w:tcW w:type="dxa" w:w="1728"/>
+            <w:tcW w:type="dxa" w:w="1872"/>
           </w:tcPr>
           <w:p>
             <w:r>
@@ -633,7 +633,7 @@
       <w:tr>
         <w:tc>
           <w:tcPr>
-            <w:tcW w:type="dxa" w:w="1728"/>
+            <w:tcW w:type="dxa" w:w="1872"/>
           </w:tcPr>
           <w:p>
             <w:r>
@@ -643,7 +643,7 @@
         </w:tc>
         <w:tc>
           <w:tcPr>
-            <w:tcW w:type="dxa" w:w="1728"/>
+            <w:tcW w:type="dxa" w:w="1872"/>
           </w:tcPr>
           <w:p>
             <w:r>
@@ -653,7 +653,7 @@
         </w:tc>
         <w:tc>
           <w:tcPr>
-            <w:tcW w:type="dxa" w:w="1728"/>
+            <w:tcW w:type="dxa" w:w="1872"/>
           </w:tcPr>
           <w:p>
             <w:r>
@@ -663,7 +663,7 @@
         </w:tc>
         <w:tc>
           <w:tcPr>
-            <w:tcW w:type="dxa" w:w="1728"/>
+            <w:tcW w:type="dxa" w:w="1872"/>
           </w:tcPr>
           <w:p>
             <w:r>
@@ -673,7 +673,7 @@
         </w:tc>
         <w:tc>
           <w:tcPr>
-            <w:tcW w:type="dxa" w:w="1728"/>
+            <w:tcW w:type="dxa" w:w="1872"/>
           </w:tcPr>
           <w:p>
             <w:r>
@@ -685,7 +685,7 @@
       <w:tr>
         <w:tc>
           <w:tcPr>
-            <w:tcW w:type="dxa" w:w="1728"/>
+            <w:tcW w:type="dxa" w:w="1872"/>
           </w:tcPr>
           <w:p>
             <w:r>
@@ -695,7 +695,7 @@
         </w:tc>
         <w:tc>
           <w:tcPr>
-            <w:tcW w:type="dxa" w:w="1728"/>
+            <w:tcW w:type="dxa" w:w="1872"/>
           </w:tcPr>
           <w:p>
             <w:r>
@@ -705,7 +705,7 @@
         </w:tc>
         <w:tc>
           <w:tcPr>
-            <w:tcW w:type="dxa" w:w="1728"/>
+            <w:tcW w:type="dxa" w:w="1872"/>
           </w:tcPr>
           <w:p>
             <w:r>
@@ -715,7 +715,7 @@
         </w:tc>
         <w:tc>
           <w:tcPr>
-            <w:tcW w:type="dxa" w:w="1728"/>
+            <w:tcW w:type="dxa" w:w="1872"/>
           </w:tcPr>
           <w:p>
             <w:r>
@@ -725,7 +725,7 @@
         </w:tc>
         <w:tc>
           <w:tcPr>
-            <w:tcW w:type="dxa" w:w="1728"/>
+            <w:tcW w:type="dxa" w:w="1872"/>
           </w:tcPr>
           <w:p>
             <w:r>
@@ -737,7 +737,7 @@
       <w:tr>
         <w:tc>
           <w:tcPr>
-            <w:tcW w:type="dxa" w:w="1728"/>
+            <w:tcW w:type="dxa" w:w="1872"/>
           </w:tcPr>
           <w:p>
             <w:r>
@@ -747,7 +747,7 @@
         </w:tc>
         <w:tc>
           <w:tcPr>
-            <w:tcW w:type="dxa" w:w="1728"/>
+            <w:tcW w:type="dxa" w:w="1872"/>
           </w:tcPr>
           <w:p>
             <w:r>
@@ -757,7 +757,7 @@
         </w:tc>
         <w:tc>
           <w:tcPr>
-            <w:tcW w:type="dxa" w:w="1728"/>
+            <w:tcW w:type="dxa" w:w="1872"/>
           </w:tcPr>
           <w:p>
             <w:r>
@@ -767,7 +767,7 @@
         </w:tc>
         <w:tc>
           <w:tcPr>
-            <w:tcW w:type="dxa" w:w="1728"/>
+            <w:tcW w:type="dxa" w:w="1872"/>
           </w:tcPr>
           <w:p>
             <w:r>
@@ -777,7 +777,7 @@
         </w:tc>
         <w:tc>
           <w:tcPr>
-            <w:tcW w:type="dxa" w:w="1728"/>
+            <w:tcW w:type="dxa" w:w="1872"/>
           </w:tcPr>
           <w:p>
             <w:r>
@@ -788,13 +788,105 @@
       </w:tr>
     </w:tbl>
     <w:sectPr>
+      <w:headerReference w:type="default" r:id="rId9"/>
+      <w:footerReference w:type="default" r:id="rId10"/>
       <w:pgSz w:w="12240" w:h="15840"/>
-      <w:pgMar w:top="1440" w:right="1800" w:bottom="1440" w:left="1800" w:header="720" w:footer="720" w:gutter="0"/>
+      <w:pgMar w:top="2160" w:right="1440" w:bottom="2160" w:left="1440" w:header="720" w:footer="720" w:gutter="0"/>
       <w:cols w:space="720"/>
       <w:docGrid w:linePitch="360"/>
     </w:sectPr>
   </w:body>
 </w:document>
+</file>
+
+<file path=word/footer1.xml><?xml version="1.0" encoding="utf-8"?>
+<w:ftr xmlns:m="http://schemas.openxmlformats.org/officeDocument/2006/math" xmlns:mc="http://schemas.openxmlformats.org/markup-compatibility/2006" xmlns:mo="http://schemas.microsoft.com/office/mac/office/2008/main" xmlns:mv="urn:schemas-microsoft-com:mac:vml" xmlns:o="urn:schemas-microsoft-com:office:office" xmlns:r="http://schemas.openxmlformats.org/officeDocument/2006/relationships" xmlns:v="urn:schemas-microsoft-com:vml" xmlns:w10="urn:schemas-microsoft-com:office:word" xmlns:w14="http://schemas.microsoft.com/office/word/2010/wordml" xmlns:w="http://schemas.openxmlformats.org/wordprocessingml/2006/main" xmlns:wne="http://schemas.microsoft.com/office/word/2006/wordml" xmlns:wp14="http://schemas.microsoft.com/office/word/2010/wordprocessingDrawing" xmlns:wp="http://schemas.openxmlformats.org/drawingml/2006/wordprocessingDrawing" xmlns:wpc="http://schemas.microsoft.com/office/word/2010/wordprocessingCanvas" xmlns:wpg="http://schemas.microsoft.com/office/word/2010/wordprocessingGroup" xmlns:wpi="http://schemas.microsoft.com/office/word/2010/wordprocessingInk" xmlns:wps="http://schemas.microsoft.com/office/word/2010/wordprocessingShape" mc:Ignorable="w14 wp14">
+  <w:p>
+    <w:pPr>
+      <w:pStyle w:val="Footer"/>
+      <w:jc w:val="center"/>
+    </w:pPr>
+    <w:r>
+      <w:drawing>
+        <wp:inline xmlns:a="http://schemas.openxmlformats.org/drawingml/2006/main" xmlns:pic="http://schemas.openxmlformats.org/drawingml/2006/picture">
+          <wp:extent cx="7772400" cy="1100374"/>
+          <wp:docPr id="1" name="Picture 1"/>
+          <wp:cNvGraphicFramePr>
+            <a:graphicFrameLocks noChangeAspect="1"/>
+          </wp:cNvGraphicFramePr>
+          <a:graphic>
+            <a:graphicData uri="http://schemas.openxmlformats.org/drawingml/2006/picture">
+              <pic:pic>
+                <pic:nvPicPr>
+                  <pic:cNvPr id="0" name="footer.png"/>
+                  <pic:cNvPicPr/>
+                </pic:nvPicPr>
+                <pic:blipFill>
+                  <a:blip r:embed="rId1"/>
+                  <a:stretch>
+                    <a:fillRect/>
+                  </a:stretch>
+                </pic:blipFill>
+                <pic:spPr>
+                  <a:xfrm>
+                    <a:off x="0" y="0"/>
+                    <a:ext cx="7772400" cy="1100374"/>
+                  </a:xfrm>
+                  <a:prstGeom prst="rect"/>
+                </pic:spPr>
+              </pic:pic>
+            </a:graphicData>
+          </a:graphic>
+        </wp:inline>
+      </w:drawing>
+    </w:r>
+  </w:p>
+</w:ftr>
+</file>
+
+<file path=word/header1.xml><?xml version="1.0" encoding="utf-8"?>
+<w:hdr xmlns:m="http://schemas.openxmlformats.org/officeDocument/2006/math" xmlns:mc="http://schemas.openxmlformats.org/markup-compatibility/2006" xmlns:mo="http://schemas.microsoft.com/office/mac/office/2008/main" xmlns:mv="urn:schemas-microsoft-com:mac:vml" xmlns:o="urn:schemas-microsoft-com:office:office" xmlns:r="http://schemas.openxmlformats.org/officeDocument/2006/relationships" xmlns:v="urn:schemas-microsoft-com:vml" xmlns:w10="urn:schemas-microsoft-com:office:word" xmlns:w14="http://schemas.microsoft.com/office/word/2010/wordml" xmlns:w="http://schemas.openxmlformats.org/wordprocessingml/2006/main" xmlns:wne="http://schemas.microsoft.com/office/word/2006/wordml" xmlns:wp14="http://schemas.microsoft.com/office/word/2010/wordprocessingDrawing" xmlns:wp="http://schemas.openxmlformats.org/drawingml/2006/wordprocessingDrawing" xmlns:wpc="http://schemas.microsoft.com/office/word/2010/wordprocessingCanvas" xmlns:wpg="http://schemas.microsoft.com/office/word/2010/wordprocessingGroup" xmlns:wpi="http://schemas.microsoft.com/office/word/2010/wordprocessingInk" xmlns:wps="http://schemas.microsoft.com/office/word/2010/wordprocessingShape" mc:Ignorable="w14 wp14">
+  <w:p>
+    <w:pPr>
+      <w:pStyle w:val="Header"/>
+      <w:jc w:val="center"/>
+    </w:pPr>
+    <w:r>
+      <w:drawing>
+        <wp:inline xmlns:a="http://schemas.openxmlformats.org/drawingml/2006/main" xmlns:pic="http://schemas.openxmlformats.org/drawingml/2006/picture">
+          <wp:extent cx="7772400" cy="1315081"/>
+          <wp:docPr id="1" name="Picture 1"/>
+          <wp:cNvGraphicFramePr>
+            <a:graphicFrameLocks noChangeAspect="1"/>
+          </wp:cNvGraphicFramePr>
+          <a:graphic>
+            <a:graphicData uri="http://schemas.openxmlformats.org/drawingml/2006/picture">
+              <pic:pic>
+                <pic:nvPicPr>
+                  <pic:cNvPr id="0" name="header.png"/>
+                  <pic:cNvPicPr/>
+                </pic:nvPicPr>
+                <pic:blipFill>
+                  <a:blip r:embed="rId1"/>
+                  <a:stretch>
+                    <a:fillRect/>
+                  </a:stretch>
+                </pic:blipFill>
+                <pic:spPr>
+                  <a:xfrm>
+                    <a:off x="0" y="0"/>
+                    <a:ext cx="7772400" cy="1315081"/>
+                  </a:xfrm>
+                  <a:prstGeom prst="rect"/>
+                </pic:spPr>
+              </pic:pic>
+            </a:graphicData>
+          </a:graphic>
+        </wp:inline>
+      </w:drawing>
+    </w:r>
+  </w:p>
+</w:hdr>
 </file>
 
 <file path=word/numbering.xml><?xml version="1.0" encoding="utf-8"?>

</xml_diff>

<commit_message>
docs: update team name to Acrobats and fix banner scaling in DOCX
</commit_message>
<xml_diff>
--- a/Stage1_Report.docx
+++ b/Stage1_Report.docx
@@ -67,7 +67,7 @@
           </w:tcPr>
           <w:p>
             <w:r>
-              <w:t>Persistent Formation</w:t>
+              <w:t>Acrobats</w:t>
             </w:r>
           </w:p>
         </w:tc>
@@ -809,7 +809,7 @@
     <w:r>
       <w:drawing>
         <wp:inline xmlns:a="http://schemas.openxmlformats.org/drawingml/2006/main" xmlns:pic="http://schemas.openxmlformats.org/drawingml/2006/picture">
-          <wp:extent cx="7772400" cy="1100374"/>
+          <wp:extent cx="5943600" cy="391578"/>
           <wp:docPr id="1" name="Picture 1"/>
           <wp:cNvGraphicFramePr>
             <a:graphicFrameLocks noChangeAspect="1"/>
@@ -818,7 +818,7 @@
             <a:graphicData uri="http://schemas.openxmlformats.org/drawingml/2006/picture">
               <pic:pic>
                 <pic:nvPicPr>
-                  <pic:cNvPr id="0" name="footer.png"/>
+                  <pic:cNvPr id="0" name="footer_banner.png"/>
                   <pic:cNvPicPr/>
                 </pic:nvPicPr>
                 <pic:blipFill>
@@ -830,7 +830,7 @@
                 <pic:spPr>
                   <a:xfrm>
                     <a:off x="0" y="0"/>
-                    <a:ext cx="7772400" cy="1100374"/>
+                    <a:ext cx="5943600" cy="391578"/>
                   </a:xfrm>
                   <a:prstGeom prst="rect"/>
                 </pic:spPr>
@@ -854,7 +854,7 @@
     <w:r>
       <w:drawing>
         <wp:inline xmlns:a="http://schemas.openxmlformats.org/drawingml/2006/main" xmlns:pic="http://schemas.openxmlformats.org/drawingml/2006/picture">
-          <wp:extent cx="7772400" cy="1315081"/>
+          <wp:extent cx="5943600" cy="680600"/>
           <wp:docPr id="1" name="Picture 1"/>
           <wp:cNvGraphicFramePr>
             <a:graphicFrameLocks noChangeAspect="1"/>
@@ -863,7 +863,7 @@
             <a:graphicData uri="http://schemas.openxmlformats.org/drawingml/2006/picture">
               <pic:pic>
                 <pic:nvPicPr>
-                  <pic:cNvPr id="0" name="header.png"/>
+                  <pic:cNvPr id="0" name="header_banner.png"/>
                   <pic:cNvPicPr/>
                 </pic:nvPicPr>
                 <pic:blipFill>
@@ -875,7 +875,7 @@
                 <pic:spPr>
                   <a:xfrm>
                     <a:off x="0" y="0"/>
-                    <a:ext cx="7772400" cy="1315081"/>
+                    <a:ext cx="5943600" cy="680600"/>
                   </a:xfrm>
                   <a:prstGeom prst="rect"/>
                 </pic:spPr>

</xml_diff>